<commit_message>
Roles plan Phase 4: interview schedule and dashboard
Migration 006 (interview_schedule, with its rollback line); schedule pages
(/viewschedulelist, /createschedule, /updateschedule/{k}, POST /saveschedule,
POST /cancelschedule/{k}, /myschedule) with roles: Super Admin and HR manage,
Hiring Manager views, Interviewer sees only their own. The interviewer must be
assigned and active; no double booking at the same minute. Home page dashboard
by role; the "Coming soon" menu entry and tile are replaced by real links (G3).

Tests: 452, 312 pass, 140 skipped without Docker (the new DAO tests and the JSPs
have not run against MySQL or Tomcat: DB-verified NO). Docs, the manual SQL
checklist (acceptance/roles-phase4.md) and the three handbooks are updated.

Co-Authored-By: Claude Sonnet 5.5 <noreply@anthropic.com>
</commit_message>
<xml_diff>
--- a/docs/handbooks/RMS Business Analyst Guide.docx
+++ b/docs/handbooks/RMS Business Analyst Guide.docx
@@ -26,7 +26,7 @@
       </w:pPr>
       <w:r>
         <w:rPr/>
-        <w:t xml:space="preserve">Describes the version on the dev branch as of 2 October 2026 (roles plan, Phase 3). Prepared from the code and the project documentation.</w:t>
+        <w:t xml:space="preserve">Describes the version on the dev branch as of 3 October 2026 (roles plan, Phase 4). Prepared from the code and the project documentation.</w:t>
       </w:r>
     </w:p>
     <w:p>
@@ -192,7 +192,7 @@
             </w:pPr>
             <w:r>
               <w:rPr/>
-              <w:t xml:space="preserve">Login, Users and Roles, Change password, Positions, Languages/skills, Jobs, Candidates with their profile and documents, assigning interviewers, interviewers' evaluations, Candidate Status (averages) and the Selected / Rejected / On hold decision.</w:t>
+              <w:t xml:space="preserve">Login, Users and Roles, Change password, Positions, Languages/skills, Jobs, Candidates with their profile and documents, assigning interviewers, interviewers' evaluations, Candidate Status (averages), interview scheduling, the home page figures (dashboard) and the Selected / Rejected / On hold decision.</w:t>
             </w:r>
           </w:p>
         </w:tc>
@@ -221,7 +221,7 @@
             </w:pPr>
             <w:r>
               <w:rPr/>
-              <w:t xml:space="preserve">Interview schedules and a dashboard (Phase 4).</w:t>
+              <w:t xml:space="preserve">E-mail or calendar notifications for interviews, and reports or exports.</w:t>
             </w:r>
           </w:p>
         </w:tc>
@@ -238,7 +238,7 @@
       </w:pPr>
       <w:r>
         <w:rPr/>
-        <w:t xml:space="preserve">The menu already shows the full recruitment workflow, but the unbuilt parts are greyed out and marked "Soon". They can't be clicked.</w:t>
+        <w:t xml:space="preserve">Every menu entry opens a working screen.</w:t>
       </w:r>
     </w:p>
     <w:p>
@@ -1946,67 +1946,298 @@
             </w:pPr>
             <w:r>
               <w:rPr/>
-              <w:t xml:space="preserve">Interview Schedules</w:t>
-            </w:r>
-          </w:p>
-        </w:tc>
-        <w:tc>
-          <w:tcPr/>
-          <w:p>
-            <w:pPr>
-              <w:pStyle w:val="TableText"/>
-            </w:pPr>
-            <w:r>
-              <w:rPr/>
-              <w:t xml:space="preserve">Coming soon</w:t>
-            </w:r>
-          </w:p>
-        </w:tc>
-        <w:tc>
-          <w:tcPr/>
-          <w:p>
-            <w:pPr>
-              <w:pStyle w:val="TableText"/>
-            </w:pPr>
-            <w:r>
-              <w:rPr/>
-              <w:t xml:space="preserve">Greyed out</w:t>
-            </w:r>
-          </w:p>
-        </w:tc>
-        <w:tc>
-          <w:tcPr/>
-          <w:p>
-            <w:pPr>
-              <w:pStyle w:val="TableText"/>
-            </w:pPr>
-            <w:r>
-              <w:rPr/>
-              <w:t xml:space="preserve">Greyed out</w:t>
-            </w:r>
-          </w:p>
-        </w:tc>
-        <w:tc>
-          <w:tcPr/>
-          <w:p>
-            <w:pPr>
-              <w:pStyle w:val="TableText"/>
-            </w:pPr>
-            <w:r>
-              <w:rPr/>
-              <w:t xml:space="preserve">—</w:t>
-            </w:r>
-          </w:p>
-        </w:tc>
-        <w:tc>
-          <w:tcPr/>
-          <w:p>
-            <w:pPr>
-              <w:pStyle w:val="TableText"/>
-            </w:pPr>
-            <w:r>
-              <w:rPr/>
-              <w:t xml:space="preserve">—</w:t>
+              <w:t xml:space="preserve">Recruitment › Interview Schedule</w:t>
+            </w:r>
+          </w:p>
+        </w:tc>
+        <w:tc>
+          <w:tcPr/>
+          <w:p>
+            <w:pPr>
+              <w:pStyle w:val="TableText"/>
+            </w:pPr>
+            <w:r>
+              <w:rPr/>
+              <w:t xml:space="preserve">Live</w:t>
+            </w:r>
+          </w:p>
+        </w:tc>
+        <w:tc>
+          <w:tcPr/>
+          <w:p>
+            <w:pPr>
+              <w:pStyle w:val="TableText"/>
+            </w:pPr>
+            <w:r>
+              <w:rPr/>
+              <w:t xml:space="preserve">Yes</w:t>
+            </w:r>
+          </w:p>
+        </w:tc>
+        <w:tc>
+          <w:tcPr/>
+          <w:p>
+            <w:pPr>
+              <w:pStyle w:val="TableText"/>
+            </w:pPr>
+            <w:r>
+              <w:rPr/>
+              <w:t xml:space="preserve">Yes</w:t>
+            </w:r>
+          </w:p>
+        </w:tc>
+        <w:tc>
+          <w:tcPr/>
+          <w:p>
+            <w:pPr>
+              <w:pStyle w:val="TableText"/>
+            </w:pPr>
+            <w:r>
+              <w:rPr/>
+              <w:t xml:space="preserve">Read-only</w:t>
+            </w:r>
+          </w:p>
+        </w:tc>
+        <w:tc>
+          <w:tcPr/>
+          <w:p>
+            <w:pPr>
+              <w:pStyle w:val="TableText"/>
+            </w:pPr>
+            <w:r>
+              <w:rPr/>
+              <w:t xml:space="preserve">Refused</w:t>
+            </w:r>
+          </w:p>
+        </w:tc>
+      </w:tr>
+      <w:tr>
+        <w:trPr>
+          <w:cantSplit/>
+        </w:trPr>
+        <w:tc>
+          <w:tcPr/>
+          <w:p>
+            <w:pPr>
+              <w:pStyle w:val="TableText"/>
+            </w:pPr>
+            <w:r>
+              <w:rPr/>
+              <w:t xml:space="preserve">Schedule, change or cancel an interview</w:t>
+            </w:r>
+          </w:p>
+        </w:tc>
+        <w:tc>
+          <w:tcPr/>
+          <w:p>
+            <w:pPr>
+              <w:pStyle w:val="TableText"/>
+            </w:pPr>
+            <w:r>
+              <w:rPr/>
+              <w:t xml:space="preserve">Live</w:t>
+            </w:r>
+          </w:p>
+        </w:tc>
+        <w:tc>
+          <w:tcPr/>
+          <w:p>
+            <w:pPr>
+              <w:pStyle w:val="TableText"/>
+            </w:pPr>
+            <w:r>
+              <w:rPr/>
+              <w:t xml:space="preserve">Yes</w:t>
+            </w:r>
+          </w:p>
+        </w:tc>
+        <w:tc>
+          <w:tcPr/>
+          <w:p>
+            <w:pPr>
+              <w:pStyle w:val="TableText"/>
+            </w:pPr>
+            <w:r>
+              <w:rPr/>
+              <w:t xml:space="preserve">Yes</w:t>
+            </w:r>
+          </w:p>
+        </w:tc>
+        <w:tc>
+          <w:tcPr/>
+          <w:p>
+            <w:pPr>
+              <w:pStyle w:val="TableText"/>
+            </w:pPr>
+            <w:r>
+              <w:rPr/>
+              <w:t xml:space="preserve">Refused</w:t>
+            </w:r>
+          </w:p>
+        </w:tc>
+        <w:tc>
+          <w:tcPr/>
+          <w:p>
+            <w:pPr>
+              <w:pStyle w:val="TableText"/>
+            </w:pPr>
+            <w:r>
+              <w:rPr/>
+              <w:t xml:space="preserve">Refused</w:t>
+            </w:r>
+          </w:p>
+        </w:tc>
+      </w:tr>
+      <w:tr>
+        <w:trPr>
+          <w:cantSplit/>
+        </w:trPr>
+        <w:tc>
+          <w:tcPr/>
+          <w:p>
+            <w:pPr>
+              <w:pStyle w:val="TableText"/>
+            </w:pPr>
+            <w:r>
+              <w:rPr/>
+              <w:t xml:space="preserve">Interviews › My Schedule</w:t>
+            </w:r>
+          </w:p>
+        </w:tc>
+        <w:tc>
+          <w:tcPr/>
+          <w:p>
+            <w:pPr>
+              <w:pStyle w:val="TableText"/>
+            </w:pPr>
+            <w:r>
+              <w:rPr/>
+              <w:t xml:space="preserve">Live</w:t>
+            </w:r>
+          </w:p>
+        </w:tc>
+        <w:tc>
+          <w:tcPr/>
+          <w:p>
+            <w:pPr>
+              <w:pStyle w:val="TableText"/>
+            </w:pPr>
+            <w:r>
+              <w:rPr/>
+              <w:t xml:space="preserve">Refused</w:t>
+            </w:r>
+          </w:p>
+        </w:tc>
+        <w:tc>
+          <w:tcPr/>
+          <w:p>
+            <w:pPr>
+              <w:pStyle w:val="TableText"/>
+            </w:pPr>
+            <w:r>
+              <w:rPr/>
+              <w:t xml:space="preserve">Refused</w:t>
+            </w:r>
+          </w:p>
+        </w:tc>
+        <w:tc>
+          <w:tcPr/>
+          <w:p>
+            <w:pPr>
+              <w:pStyle w:val="TableText"/>
+            </w:pPr>
+            <w:r>
+              <w:rPr/>
+              <w:t xml:space="preserve">Refused</w:t>
+            </w:r>
+          </w:p>
+        </w:tc>
+        <w:tc>
+          <w:tcPr/>
+          <w:p>
+            <w:pPr>
+              <w:pStyle w:val="TableText"/>
+            </w:pPr>
+            <w:r>
+              <w:rPr/>
+              <w:t xml:space="preserve">Own interviews only</w:t>
+            </w:r>
+          </w:p>
+        </w:tc>
+      </w:tr>
+      <w:tr>
+        <w:trPr>
+          <w:cantSplit/>
+        </w:trPr>
+        <w:tc>
+          <w:tcPr/>
+          <w:p>
+            <w:pPr>
+              <w:pStyle w:val="TableText"/>
+            </w:pPr>
+            <w:r>
+              <w:rPr/>
+              <w:t xml:space="preserve">Home page figures (dashboard)</w:t>
+            </w:r>
+          </w:p>
+        </w:tc>
+        <w:tc>
+          <w:tcPr/>
+          <w:p>
+            <w:pPr>
+              <w:pStyle w:val="TableText"/>
+            </w:pPr>
+            <w:r>
+              <w:rPr/>
+              <w:t xml:space="preserve">Live</w:t>
+            </w:r>
+          </w:p>
+        </w:tc>
+        <w:tc>
+          <w:tcPr/>
+          <w:p>
+            <w:pPr>
+              <w:pStyle w:val="TableText"/>
+            </w:pPr>
+            <w:r>
+              <w:rPr/>
+              <w:t xml:space="preserve">All figures</w:t>
+            </w:r>
+          </w:p>
+        </w:tc>
+        <w:tc>
+          <w:tcPr/>
+          <w:p>
+            <w:pPr>
+              <w:pStyle w:val="TableText"/>
+            </w:pPr>
+            <w:r>
+              <w:rPr/>
+              <w:t xml:space="preserve">All figures</w:t>
+            </w:r>
+          </w:p>
+        </w:tc>
+        <w:tc>
+          <w:tcPr/>
+          <w:p>
+            <w:pPr>
+              <w:pStyle w:val="TableText"/>
+            </w:pPr>
+            <w:r>
+              <w:rPr/>
+              <w:t xml:space="preserve">All figures</w:t>
+            </w:r>
+          </w:p>
+        </w:tc>
+        <w:tc>
+          <w:tcPr/>
+          <w:p>
+            <w:pPr>
+              <w:pStyle w:val="TableText"/>
+            </w:pPr>
+            <w:r>
+              <w:rPr/>
+              <w:t xml:space="preserve">Own evaluations and interviews only</w:t>
             </w:r>
           </w:p>
         </w:tc>
@@ -3418,6 +3649,121 @@
     </w:p>
     <w:p>
       <w:pPr>
+        <w:pStyle w:val="Heading2"/>
+      </w:pPr>
+      <w:r>
+        <w:rPr/>
+        <w:t xml:space="preserve">Interview schedule</w:t>
+      </w:r>
+    </w:p>
+    <w:p>
+      <w:pPr>
+        <w:pStyle w:val="Bullet"/>
+      </w:pPr>
+      <w:r>
+        <w:rPr/>
+        <w:t xml:space="preserve">•</w:t>
+        <w:tab/>
+        <w:t xml:space="preserve">Super Admin and HR schedule an interview from </w:t>
+      </w:r>
+      <w:r>
+        <w:rPr>
+          <w:b/>
+        </w:rPr>
+        <w:t xml:space="preserve">Interview Schedule › Schedule interview</w:t>
+      </w:r>
+      <w:r>
+        <w:rPr/>
+        <w:t xml:space="preserve">: first choose the candidate, then the interviewer (only people assigned to that candidate whose account is active are offered), the date and time, and an optional location.</w:t>
+      </w:r>
+    </w:p>
+    <w:p>
+      <w:pPr>
+        <w:pStyle w:val="Bullet"/>
+      </w:pPr>
+      <w:r>
+        <w:rPr/>
+        <w:t xml:space="preserve">•</w:t>
+        <w:tab/>
+        <w:t xml:space="preserve">Times are the server's local time, as typed. Two interviews for the same interviewer at the same start time are refused. Past times are accepted.</w:t>
+      </w:r>
+    </w:p>
+    <w:p>
+      <w:pPr>
+        <w:pStyle w:val="Bullet"/>
+      </w:pPr>
+      <w:r>
+        <w:rPr/>
+        <w:t xml:space="preserve">•</w:t>
+        <w:tab/>
+        <w:t xml:space="preserve">An interview can be changed, marked Done or cancelled. Cancelling keeps it in the list, marked Cancelled, and a cancelled interview can't be changed. RMS never marks an interview Done by itself and sends no notification.</w:t>
+      </w:r>
+    </w:p>
+    <w:p>
+      <w:pPr>
+        <w:pStyle w:val="Bullet"/>
+      </w:pPr>
+      <w:r>
+        <w:rPr/>
+        <w:t xml:space="preserve">•</w:t>
+        <w:tab/>
+        <w:t xml:space="preserve">Hiring Managers see the whole list read-only. Interviewers see only their own interviews, under </w:t>
+      </w:r>
+      <w:r>
+        <w:rPr>
+          <w:b/>
+        </w:rPr>
+        <w:t xml:space="preserve">My Schedule</w:t>
+      </w:r>
+      <w:r>
+        <w:rPr/>
+        <w:t xml:space="preserve">.</w:t>
+      </w:r>
+    </w:p>
+    <w:p>
+      <w:pPr>
+        <w:pStyle w:val="Heading2"/>
+      </w:pPr>
+      <w:r>
+        <w:rPr/>
+        <w:t xml:space="preserve">Home page figures (dashboard)</w:t>
+      </w:r>
+    </w:p>
+    <w:p>
+      <w:pPr>
+        <w:pStyle w:val="Bullet"/>
+      </w:pPr>
+      <w:r>
+        <w:rPr/>
+        <w:t xml:space="preserve">•</w:t>
+        <w:tab/>
+        <w:t xml:space="preserve">Super Admin, HR and Hiring Managers see: candidates by status (Selected, Rejected, On hold, Pending), evaluations still to do, upcoming interviews (with the next five), open jobs, candidates with no CV, and candidates with an inactive interviewer.</w:t>
+      </w:r>
+    </w:p>
+    <w:p>
+      <w:pPr>
+        <w:pStyle w:val="Bullet"/>
+      </w:pPr>
+      <w:r>
+        <w:rPr/>
+        <w:t xml:space="preserve">•</w:t>
+        <w:tab/>
+        <w:t xml:space="preserve">Interviewers see their own evaluations still to do and upcoming interviews.</w:t>
+      </w:r>
+    </w:p>
+    <w:p>
+      <w:pPr>
+        <w:pStyle w:val="Bullet"/>
+      </w:pPr>
+      <w:r>
+        <w:rPr/>
+        <w:t xml:space="preserve">•</w:t>
+        <w:tab/>
+        <w:t xml:space="preserve">"Evaluations still to do" counts an assigned, active interviewer who hasn't scored a candidate yet, not counting candidates already Selected or Rejected. "Candidates with an inactive interviewer" lists those who still need evaluations but have an assigned interviewer whose account is deactivated, so HR can reassign.</w:t>
+      </w:r>
+    </w:p>
+    <w:p>
+      <w:pPr>
         <w:pStyle w:val="Heading1"/>
       </w:pPr>
       <w:r>
@@ -3440,7 +3786,7 @@
       </w:pPr>
       <w:r>
         <w:rPr/>
-        <w:t xml:space="preserve">The intended process. Dashed, orange steps are not built yet.</w:t>
+        <w:t xml:space="preserve">The process as built: every step is a working screen.</w:t>
       </w:r>
     </w:p>
     <w:p>
@@ -3451,7 +3797,7 @@
         <w:drawing>
           <wp:inline distT="0" distB="0" distL="0" distR="0">
             <wp:extent cx="2514127" cy="7589520"/>
-            <wp:docPr id="1" name="Diagram 1" descr="Recruitment process: built steps in blue, missing steps in orange"/>
+            <wp:docPr id="1" name="Diagram 1" descr="Recruitment process: every step is built"/>
             <a:graphic xmlns:a="http://schemas.openxmlformats.org/drawingml/2006/main">
               <a:graphicData uri="http://schemas.openxmlformats.org/drawingml/2006/picture">
                 <pic:pic xmlns:pic="http://schemas.openxmlformats.org/drawingml/2006/picture">
@@ -3487,7 +3833,7 @@
       </w:pPr>
       <w:r>
         <w:rPr/>
-        <w:t xml:space="preserve">Recruitment process: built steps in blue, missing steps in orange</w:t>
+        <w:t xml:space="preserve">Recruitment process: every step is built</w:t>
       </w:r>
     </w:p>
     <w:p>
@@ -3995,6 +4341,119 @@
       </w:pPr>
       <w:r>
         <w:rPr/>
+        <w:t xml:space="preserve">Super Admin or HR: schedule an interview</w:t>
+      </w:r>
+    </w:p>
+    <w:p>
+      <w:pPr>
+        <w:pStyle w:val="Numbered"/>
+      </w:pPr>
+      <w:r>
+        <w:rPr/>
+        <w:t xml:space="preserve">1.</w:t>
+        <w:tab/>
+        <w:t xml:space="preserve">Open </w:t>
+      </w:r>
+      <w:r>
+        <w:rPr>
+          <w:b/>
+        </w:rPr>
+        <w:t xml:space="preserve">Interview Schedule</w:t>
+      </w:r>
+      <w:r>
+        <w:rPr/>
+        <w:t xml:space="preserve"> and click </w:t>
+      </w:r>
+      <w:r>
+        <w:rPr>
+          <w:b/>
+        </w:rPr>
+        <w:t xml:space="preserve">Schedule interview</w:t>
+      </w:r>
+      <w:r>
+        <w:rPr/>
+        <w:t xml:space="preserve">.</w:t>
+      </w:r>
+    </w:p>
+    <w:p>
+      <w:pPr>
+        <w:pStyle w:val="Numbered"/>
+      </w:pPr>
+      <w:r>
+        <w:rPr/>
+        <w:t xml:space="preserve">2.</w:t>
+        <w:tab/>
+        <w:t xml:space="preserve">Choose the candidate and click </w:t>
+      </w:r>
+      <w:r>
+        <w:rPr>
+          <w:b/>
+        </w:rPr>
+        <w:t xml:space="preserve">Next</w:t>
+      </w:r>
+      <w:r>
+        <w:rPr/>
+        <w:t xml:space="preserve">.</w:t>
+      </w:r>
+    </w:p>
+    <w:p>
+      <w:pPr>
+        <w:pStyle w:val="Numbered"/>
+      </w:pPr>
+      <w:r>
+        <w:rPr/>
+        <w:t xml:space="preserve">3.</w:t>
+        <w:tab/>
+        <w:t xml:space="preserve">Choose the interviewer, enter the date, time and (optionally) the location, and click </w:t>
+      </w:r>
+      <w:r>
+        <w:rPr>
+          <w:b/>
+        </w:rPr>
+        <w:t xml:space="preserve">Save</w:t>
+      </w:r>
+      <w:r>
+        <w:rPr/>
+        <w:t xml:space="preserve">. If no interviewer is offered, assign one on the candidate's profile first.</w:t>
+      </w:r>
+    </w:p>
+    <w:p>
+      <w:pPr>
+        <w:pStyle w:val="Numbered"/>
+      </w:pPr>
+      <w:r>
+        <w:rPr/>
+        <w:t xml:space="preserve">4.</w:t>
+        <w:tab/>
+        <w:t xml:space="preserve">To change an interview use </w:t>
+      </w:r>
+      <w:r>
+        <w:rPr>
+          <w:b/>
+        </w:rPr>
+        <w:t xml:space="preserve">Edit</w:t>
+      </w:r>
+      <w:r>
+        <w:rPr/>
+        <w:t xml:space="preserve"> (set Status to Done afterwards, if you like); to cancel it use </w:t>
+      </w:r>
+      <w:r>
+        <w:rPr>
+          <w:b/>
+        </w:rPr>
+        <w:t xml:space="preserve">Cancel</w:t>
+      </w:r>
+      <w:r>
+        <w:rPr/>
+        <w:t xml:space="preserve"> and confirm.</w:t>
+      </w:r>
+    </w:p>
+    <w:p>
+      <w:pPr>
+        <w:pStyle w:val="Heading2"/>
+      </w:pPr>
+      <w:r>
+        <w:rPr/>
         <w:t xml:space="preserve">Super Admin, HR or Hiring Manager: review results and decide</w:t>
       </w:r>
     </w:p>
@@ -4660,6 +5119,47 @@
             </w:pPr>
             <w:r>
               <w:rPr/>
+              <w:t xml:space="preserve">Interview</w:t>
+            </w:r>
+          </w:p>
+        </w:tc>
+        <w:tc>
+          <w:tcPr/>
+          <w:p>
+            <w:pPr>
+              <w:pStyle w:val="TableText"/>
+            </w:pPr>
+            <w:r>
+              <w:rPr/>
+              <w:t xml:space="preserve">Candidate, interviewer, start date and time (the server's time), location, status (Scheduled, Done, Cancelled), who created and changed it</w:t>
+            </w:r>
+          </w:p>
+        </w:tc>
+        <w:tc>
+          <w:tcPr/>
+          <w:p>
+            <w:pPr>
+              <w:pStyle w:val="TableText"/>
+            </w:pPr>
+            <w:r>
+              <w:rPr/>
+              <w:t xml:space="preserve">Yes (Super Admin, HR)</w:t>
+            </w:r>
+          </w:p>
+        </w:tc>
+      </w:tr>
+      <w:tr>
+        <w:trPr>
+          <w:cantSplit/>
+        </w:trPr>
+        <w:tc>
+          <w:tcPr/>
+          <w:p>
+            <w:pPr>
+              <w:pStyle w:val="TableText"/>
+            </w:pPr>
+            <w:r>
+              <w:rPr/>
               <w:t xml:space="preserve">Decision</w:t>
             </w:r>
           </w:p>
@@ -5020,6 +5520,17 @@
         <w:t xml:space="preserve">•</w:t>
         <w:tab/>
         <w:t xml:space="preserve">A decision needs a reason and a date that isn't in the future; it is made by a person, never by the system.</w:t>
+      </w:r>
+    </w:p>
+    <w:p>
+      <w:pPr>
+        <w:pStyle w:val="Bullet"/>
+      </w:pPr>
+      <w:r>
+        <w:rPr/>
+        <w:t xml:space="preserve">•</w:t>
+        <w:tab/>
+        <w:t xml:space="preserve">An interview needs an interviewer who is assigned to the candidate and active, and a date and time; the same interviewer can't have two interviews at the same start time; only a Scheduled interview can be cancelled, and a cancelled one can't be changed.</w:t>
       </w:r>
     </w:p>
     <w:p>
@@ -5136,43 +5647,43 @@
             </w:pPr>
             <w:r>
               <w:rPr/>
-              <w:t xml:space="preserve">G3</w:t>
-            </w:r>
-          </w:p>
-        </w:tc>
-        <w:tc>
-          <w:tcPr/>
-          <w:p>
-            <w:pPr>
-              <w:pStyle w:val="TableText"/>
-            </w:pPr>
-            <w:r>
-              <w:rPr/>
-              <w:t xml:space="preserve">Interview schedules and a dashboard</w:t>
-            </w:r>
-          </w:p>
-        </w:tc>
-        <w:tc>
-          <w:tcPr/>
-          <w:p>
-            <w:pPr>
-              <w:pStyle w:val="TableText"/>
-            </w:pPr>
-            <w:r>
-              <w:rPr/>
-              <w:t xml:space="preserve">Planned: Phase 4</w:t>
-            </w:r>
-          </w:p>
-        </w:tc>
-        <w:tc>
-          <w:tcPr/>
-          <w:p>
-            <w:pPr>
-              <w:pStyle w:val="TableText"/>
-            </w:pPr>
-            <w:r>
-              <w:rPr/>
-              <w:t xml:space="preserve">Medium.</w:t>
+              <w:t xml:space="preserve">G34</w:t>
+            </w:r>
+          </w:p>
+        </w:tc>
+        <w:tc>
+          <w:tcPr/>
+          <w:p>
+            <w:pPr>
+              <w:pStyle w:val="TableText"/>
+            </w:pPr>
+            <w:r>
+              <w:rPr/>
+              <w:t xml:space="preserve">Names in non-Latin scripts (for example Bengali, Cyrillic)</w:t>
+            </w:r>
+          </w:p>
+        </w:tc>
+        <w:tc>
+          <w:tcPr/>
+          <w:p>
+            <w:pPr>
+              <w:pStyle w:val="TableText"/>
+            </w:pPr>
+            <w:r>
+              <w:rPr/>
+              <w:t xml:space="preserve">Partial</w:t>
+            </w:r>
+          </w:p>
+        </w:tc>
+        <w:tc>
+          <w:tcPr/>
+          <w:p>
+            <w:pPr>
+              <w:pStyle w:val="TableText"/>
+            </w:pPr>
+            <w:r>
+              <w:rPr/>
+              <w:t xml:space="preserve">Such names are stored as codes and display incorrectly.</w:t>
             </w:r>
           </w:p>
         </w:tc>
@@ -5189,43 +5700,43 @@
             </w:pPr>
             <w:r>
               <w:rPr/>
-              <w:t xml:space="preserve">G34</w:t>
-            </w:r>
-          </w:p>
-        </w:tc>
-        <w:tc>
-          <w:tcPr/>
-          <w:p>
-            <w:pPr>
-              <w:pStyle w:val="TableText"/>
-            </w:pPr>
-            <w:r>
-              <w:rPr/>
-              <w:t xml:space="preserve">Names in non-Latin scripts (for example Bengali, Cyrillic)</w:t>
-            </w:r>
-          </w:p>
-        </w:tc>
-        <w:tc>
-          <w:tcPr/>
-          <w:p>
-            <w:pPr>
-              <w:pStyle w:val="TableText"/>
-            </w:pPr>
-            <w:r>
-              <w:rPr/>
-              <w:t xml:space="preserve">Partial</w:t>
-            </w:r>
-          </w:p>
-        </w:tc>
-        <w:tc>
-          <w:tcPr/>
-          <w:p>
-            <w:pPr>
-              <w:pStyle w:val="TableText"/>
-            </w:pPr>
-            <w:r>
-              <w:rPr/>
-              <w:t xml:space="preserve">Such names are stored as codes and display incorrectly.</w:t>
+              <w:t xml:space="preserve">—</w:t>
+            </w:r>
+          </w:p>
+        </w:tc>
+        <w:tc>
+          <w:tcPr/>
+          <w:p>
+            <w:pPr>
+              <w:pStyle w:val="TableText"/>
+            </w:pPr>
+            <w:r>
+              <w:rPr/>
+              <w:t xml:space="preserve">Reports or export (Excel, PDF)</w:t>
+            </w:r>
+          </w:p>
+        </w:tc>
+        <w:tc>
+          <w:tcPr/>
+          <w:p>
+            <w:pPr>
+              <w:pStyle w:val="TableText"/>
+            </w:pPr>
+            <w:r>
+              <w:rPr/>
+              <w:t xml:space="preserve">Not built</w:t>
+            </w:r>
+          </w:p>
+        </w:tc>
+        <w:tc>
+          <w:tcPr/>
+          <w:p>
+            <w:pPr>
+              <w:pStyle w:val="TableText"/>
+            </w:pPr>
+            <w:r>
+              <w:rPr/>
+              <w:t xml:space="preserve">Results can only be viewed on screen.</w:t>
             </w:r>
           </w:p>
         </w:tc>
@@ -5254,59 +5765,6 @@
             </w:pPr>
             <w:r>
               <w:rPr/>
-              <w:t xml:space="preserve">Reports or export (Excel, PDF)</w:t>
-            </w:r>
-          </w:p>
-        </w:tc>
-        <w:tc>
-          <w:tcPr/>
-          <w:p>
-            <w:pPr>
-              <w:pStyle w:val="TableText"/>
-            </w:pPr>
-            <w:r>
-              <w:rPr/>
-              <w:t xml:space="preserve">Not built</w:t>
-            </w:r>
-          </w:p>
-        </w:tc>
-        <w:tc>
-          <w:tcPr/>
-          <w:p>
-            <w:pPr>
-              <w:pStyle w:val="TableText"/>
-            </w:pPr>
-            <w:r>
-              <w:rPr/>
-              <w:t xml:space="preserve">Results can only be viewed on screen.</w:t>
-            </w:r>
-          </w:p>
-        </w:tc>
-      </w:tr>
-      <w:tr>
-        <w:trPr>
-          <w:cantSplit/>
-        </w:trPr>
-        <w:tc>
-          <w:tcPr/>
-          <w:p>
-            <w:pPr>
-              <w:pStyle w:val="TableText"/>
-            </w:pPr>
-            <w:r>
-              <w:rPr/>
-              <w:t xml:space="preserve">—</w:t>
-            </w:r>
-          </w:p>
-        </w:tc>
-        <w:tc>
-          <w:tcPr/>
-          <w:p>
-            <w:pPr>
-              <w:pStyle w:val="TableText"/>
-            </w:pPr>
-            <w:r>
-              <w:rPr/>
               <w:t xml:space="preserve">Audit trail (who changed what, when)</w:t>
             </w:r>
           </w:p>
@@ -5348,7 +5806,7 @@
       </w:pPr>
       <w:r>
         <w:rPr/>
-        <w:t xml:space="preserve">11. Decisions made (2 October 2026)</w:t>
+        <w:t xml:space="preserve">11. Decisions made (2 and 3 October 2026)</w:t>
       </w:r>
     </w:p>
     <w:p>
@@ -5521,6 +5979,27 @@
     </w:p>
     <w:p>
       <w:pPr>
+        <w:pStyle w:val="Numbered"/>
+      </w:pPr>
+      <w:r>
+        <w:rPr/>
+        <w:t xml:space="preserve">9.</w:t>
+        <w:tab/>
+        <w:t xml:space="preserve"/>
+      </w:r>
+      <w:r>
+        <w:rPr>
+          <w:b/>
+        </w:rPr>
+        <w:t xml:space="preserve">Interview schedule and dashboard</w:t>
+      </w:r>
+      <w:r>
+        <w:rPr/>
+        <w:t xml:space="preserve"> (built in Phase 4): an interview is for an assigned, active interviewer; times are the server's local time; no notifications yet; the home page shows the figures listed above.</w:t>
+      </w:r>
+    </w:p>
+    <w:p>
+      <w:pPr>
         <w:pStyle w:val="Heading1"/>
       </w:pPr>
       <w:r>
@@ -5567,7 +6046,7 @@
       </w:r>
       <w:r>
         <w:rPr/>
-        <w:t xml:space="preserve"> are e-mail notifications needed for interviews?</w:t>
+        <w:t xml:space="preserve"> are e-mail or calendar notifications needed for interviews? Should past times be refused, and do all users work in the server's time zone?</w:t>
       </w:r>
     </w:p>
     <w:p>

</xml_diff>

<commit_message>
Reports, activity log and English-only text
CSV reports (candidates, candidate status, interview schedule, activity log),
activity_log table (migration 007) recording marking, decisions, interviews,
assignments, candidate and user changes and report downloads, English-only
validation (G34 closed), docs and the three handbooks.

Co-Authored-By: Claude Sonnet 5.5 <noreply@anthropic.com>
</commit_message>
<xml_diff>
--- a/docs/handbooks/RMS Business Analyst Guide.docx
+++ b/docs/handbooks/RMS Business Analyst Guide.docx
@@ -26,7 +26,7 @@
       </w:pPr>
       <w:r>
         <w:rPr/>
-        <w:t xml:space="preserve">Describes the version on the master and dev branches as of 3 October 2026 (roles plan, Phases 1-4). Prepared from the code and the project documentation.</w:t>
+        <w:t xml:space="preserve">Describes the version on the master and dev branches as of 3 October 2026 (roles plan, Phases 1-4, plus reports, the activity log and English-only text). Prepared from the code and the project documentation.</w:t>
       </w:r>
     </w:p>
     <w:p>
@@ -192,7 +192,7 @@
             </w:pPr>
             <w:r>
               <w:rPr/>
-              <w:t xml:space="preserve">Login, Users and Roles, Change password, Positions, Languages/skills, Jobs, Candidates with their profile and documents, assigning interviewers, interviewers' evaluations, Candidate Status (averages), interview scheduling, the home page figures (dashboard) and the Selected / Rejected / On hold decision.</w:t>
+              <w:t xml:space="preserve">Login, Users and Roles, Change password, Positions, Languages/skills, Jobs, Candidates with their profile and documents, assigning interviewers, interviewers' evaluations, Candidate Status (averages), interview scheduling, CSV reports, the activity log, the home page figures (dashboard) and the Selected / Rejected / On hold decision.</w:t>
             </w:r>
           </w:p>
         </w:tc>
@@ -221,7 +221,7 @@
             </w:pPr>
             <w:r>
               <w:rPr/>
-              <w:t xml:space="preserve">E-mail or calendar notifications for interviews, and reports or exports.</w:t>
+              <w:t xml:space="preserve">E-mail or calendar notifications for interviews (to be decided later), Excel (.xlsx) and PDF reports.</w:t>
             </w:r>
           </w:p>
         </w:tc>
@@ -2254,6 +2254,160 @@
             </w:pPr>
             <w:r>
               <w:rPr/>
+              <w:t xml:space="preserve">Reports (CSV downloads: candidates, candidate status, interview schedule)</w:t>
+            </w:r>
+          </w:p>
+        </w:tc>
+        <w:tc>
+          <w:tcPr/>
+          <w:p>
+            <w:pPr>
+              <w:pStyle w:val="TableText"/>
+            </w:pPr>
+            <w:r>
+              <w:rPr/>
+              <w:t xml:space="preserve">Live</w:t>
+            </w:r>
+          </w:p>
+        </w:tc>
+        <w:tc>
+          <w:tcPr/>
+          <w:p>
+            <w:pPr>
+              <w:pStyle w:val="TableText"/>
+            </w:pPr>
+            <w:r>
+              <w:rPr/>
+              <w:t xml:space="preserve">Yes</w:t>
+            </w:r>
+          </w:p>
+        </w:tc>
+        <w:tc>
+          <w:tcPr/>
+          <w:p>
+            <w:pPr>
+              <w:pStyle w:val="TableText"/>
+            </w:pPr>
+            <w:r>
+              <w:rPr/>
+              <w:t xml:space="preserve">Yes</w:t>
+            </w:r>
+          </w:p>
+        </w:tc>
+        <w:tc>
+          <w:tcPr/>
+          <w:p>
+            <w:pPr>
+              <w:pStyle w:val="TableText"/>
+            </w:pPr>
+            <w:r>
+              <w:rPr/>
+              <w:t xml:space="preserve">Yes</w:t>
+            </w:r>
+          </w:p>
+        </w:tc>
+        <w:tc>
+          <w:tcPr/>
+          <w:p>
+            <w:pPr>
+              <w:pStyle w:val="TableText"/>
+            </w:pPr>
+            <w:r>
+              <w:rPr/>
+              <w:t xml:space="preserve">Refused</w:t>
+            </w:r>
+          </w:p>
+        </w:tc>
+      </w:tr>
+      <w:tr>
+        <w:trPr>
+          <w:cantSplit/>
+        </w:trPr>
+        <w:tc>
+          <w:tcPr/>
+          <w:p>
+            <w:pPr>
+              <w:pStyle w:val="TableText"/>
+            </w:pPr>
+            <w:r>
+              <w:rPr/>
+              <w:t xml:space="preserve">Administration › Activity Log, and its CSV download</w:t>
+            </w:r>
+          </w:p>
+        </w:tc>
+        <w:tc>
+          <w:tcPr/>
+          <w:p>
+            <w:pPr>
+              <w:pStyle w:val="TableText"/>
+            </w:pPr>
+            <w:r>
+              <w:rPr/>
+              <w:t xml:space="preserve">Live</w:t>
+            </w:r>
+          </w:p>
+        </w:tc>
+        <w:tc>
+          <w:tcPr/>
+          <w:p>
+            <w:pPr>
+              <w:pStyle w:val="TableText"/>
+            </w:pPr>
+            <w:r>
+              <w:rPr/>
+              <w:t xml:space="preserve">Yes</w:t>
+            </w:r>
+          </w:p>
+        </w:tc>
+        <w:tc>
+          <w:tcPr/>
+          <w:p>
+            <w:pPr>
+              <w:pStyle w:val="TableText"/>
+            </w:pPr>
+            <w:r>
+              <w:rPr/>
+              <w:t xml:space="preserve">Refused</w:t>
+            </w:r>
+          </w:p>
+        </w:tc>
+        <w:tc>
+          <w:tcPr/>
+          <w:p>
+            <w:pPr>
+              <w:pStyle w:val="TableText"/>
+            </w:pPr>
+            <w:r>
+              <w:rPr/>
+              <w:t xml:space="preserve">Refused</w:t>
+            </w:r>
+          </w:p>
+        </w:tc>
+        <w:tc>
+          <w:tcPr/>
+          <w:p>
+            <w:pPr>
+              <w:pStyle w:val="TableText"/>
+            </w:pPr>
+            <w:r>
+              <w:rPr/>
+              <w:t xml:space="preserve">Refused</w:t>
+            </w:r>
+          </w:p>
+        </w:tc>
+      </w:tr>
+      <w:tr>
+        <w:trPr>
+          <w:cantSplit/>
+        </w:trPr>
+        <w:tc>
+          <w:tcPr/>
+          <w:p>
+            <w:pPr>
+              <w:pStyle w:val="TableText"/>
+            </w:pPr>
+            <w:r>
+              <w:rPr/>
               <w:t xml:space="preserve">Log out (top bar)</w:t>
             </w:r>
           </w:p>
@@ -3718,6 +3872,221 @@
       <w:r>
         <w:rPr/>
         <w:t xml:space="preserve">.</w:t>
+      </w:r>
+    </w:p>
+    <w:p>
+      <w:pPr>
+        <w:pStyle w:val="Heading2"/>
+      </w:pPr>
+      <w:r>
+        <w:rPr/>
+        <w:t xml:space="preserve">Reports</w:t>
+      </w:r>
+    </w:p>
+    <w:p>
+      <w:pPr>
+        <w:pStyle w:val="Bullet"/>
+      </w:pPr>
+      <w:r>
+        <w:rPr/>
+        <w:t xml:space="preserve">•</w:t>
+        <w:tab/>
+        <w:t xml:space="preserve"/>
+      </w:r>
+      <w:r>
+        <w:rPr>
+          <w:b/>
+        </w:rPr>
+        <w:t xml:space="preserve">Reports</w:t>
+      </w:r>
+      <w:r>
+        <w:rPr/>
+        <w:t xml:space="preserve"> (menu, for Super Admin, HR and Hiring Manager) offers CSV downloads that open in Excel: </w:t>
+      </w:r>
+      <w:r>
+        <w:rPr>
+          <w:b/>
+        </w:rPr>
+        <w:t xml:space="preserve">Candidates</w:t>
+      </w:r>
+      <w:r>
+        <w:rPr/>
+        <w:t xml:space="preserve"> (with status and the reason for the decision), </w:t>
+      </w:r>
+      <w:r>
+        <w:rPr>
+          <w:b/>
+        </w:rPr>
+        <w:t xml:space="preserve">Candidate Status</w:t>
+      </w:r>
+      <w:r>
+        <w:rPr/>
+        <w:t xml:space="preserve"> (evaluation count, the average of each criterion, the total and the status) and </w:t>
+      </w:r>
+      <w:r>
+        <w:rPr>
+          <w:b/>
+        </w:rPr>
+        <w:t xml:space="preserve">Interview Schedule</w:t>
+      </w:r>
+      <w:r>
+        <w:rPr/>
+        <w:t xml:space="preserve">. A Super Admin also sees </w:t>
+      </w:r>
+      <w:r>
+        <w:rPr>
+          <w:b/>
+        </w:rPr>
+        <w:t xml:space="preserve">Activity Log</w:t>
+      </w:r>
+      <w:r>
+        <w:rPr/>
+        <w:t xml:space="preserve">.</w:t>
+      </w:r>
+    </w:p>
+    <w:p>
+      <w:pPr>
+        <w:pStyle w:val="Bullet"/>
+      </w:pPr>
+      <w:r>
+        <w:rPr/>
+        <w:t xml:space="preserve">•</w:t>
+        <w:tab/>
+        <w:t xml:space="preserve">A download contains what the matching screen shows, nothing more. A cell that starts with = + - or @ is shown with a leading apostrophe so that Excel never runs it as a formula; phone numbers that start with + therefore show an apostrophe.</w:t>
+      </w:r>
+    </w:p>
+    <w:p>
+      <w:pPr>
+        <w:pStyle w:val="Bullet"/>
+      </w:pPr>
+      <w:r>
+        <w:rPr/>
+        <w:t xml:space="preserve">•</w:t>
+        <w:tab/>
+        <w:t xml:space="preserve">Every download is recorded in the activity log. Excel (.xlsx) and PDF files are not offered.</w:t>
+      </w:r>
+    </w:p>
+    <w:p>
+      <w:pPr>
+        <w:pStyle w:val="Heading2"/>
+      </w:pPr>
+      <w:r>
+        <w:rPr/>
+        <w:t xml:space="preserve">Activity log (Super Admin)</w:t>
+      </w:r>
+    </w:p>
+    <w:p>
+      <w:pPr>
+        <w:pStyle w:val="Bullet"/>
+      </w:pPr>
+      <w:r>
+        <w:rPr/>
+        <w:t xml:space="preserve">•</w:t>
+        <w:tab/>
+        <w:t xml:space="preserve"/>
+      </w:r>
+      <w:r>
+        <w:rPr>
+          <w:b/>
+        </w:rPr>
+        <w:t xml:space="preserve">Activity Log</w:t>
+      </w:r>
+      <w:r>
+        <w:rPr/>
+        <w:t xml:space="preserve"> (menu, Super Admin only) shows the newest 500 recorded actions with the time, the user, the action, the candidate or user it concerned and a short detail. It can be filtered by action and downloaded as CSV. Nobody can edit or delete an entry in RMS.</w:t>
+      </w:r>
+    </w:p>
+    <w:p>
+      <w:pPr>
+        <w:pStyle w:val="Bullet"/>
+      </w:pPr>
+      <w:r>
+        <w:rPr/>
+        <w:t xml:space="preserve">•</w:t>
+        <w:tab/>
+        <w:t xml:space="preserve">Recorded: </w:t>
+      </w:r>
+      <w:r>
+        <w:rPr>
+          <w:b/>
+        </w:rPr>
+        <w:t xml:space="preserve">Marked</w:t>
+      </w:r>
+      <w:r>
+        <w:rPr/>
+        <w:t xml:space="preserve"> (an interviewer saved an evaluation, with the total score only), </w:t>
+      </w:r>
+      <w:r>
+        <w:rPr>
+          <w:b/>
+        </w:rPr>
+        <w:t xml:space="preserve">Selected</w:t>
+      </w:r>
+      <w:r>
+        <w:rPr/>
+        <w:t xml:space="preserve">, </w:t>
+      </w:r>
+      <w:r>
+        <w:rPr>
+          <w:b/>
+        </w:rPr>
+        <w:t xml:space="preserve">Rejected</w:t>
+      </w:r>
+      <w:r>
+        <w:rPr/>
+        <w:t xml:space="preserve"> and </w:t>
+      </w:r>
+      <w:r>
+        <w:rPr>
+          <w:b/>
+        </w:rPr>
+        <w:t xml:space="preserve">On hold</w:t>
+      </w:r>
+      <w:r>
+        <w:rPr/>
+        <w:t xml:space="preserve"> (decisions; the reason stays in the decision history), interviewer assigned or unassigned, interview scheduled, changed or cancelled, candidate added, changed or deleted, user added, changed, deactivated, reactivated or given a new password, and report downloaded.</w:t>
+      </w:r>
+    </w:p>
+    <w:p>
+      <w:pPr>
+        <w:pStyle w:val="Bullet"/>
+      </w:pPr>
+      <w:r>
+        <w:rPr/>
+        <w:t xml:space="preserve">•</w:t>
+        <w:tab/>
+        <w:t xml:space="preserve">Not recorded yet: sign-ins and sign-outs, document uploads and deletes, jobs and master data. Details never hold scores per criterion, comments, reasons, names or passwords.</w:t>
+      </w:r>
+    </w:p>
+    <w:p>
+      <w:pPr>
+        <w:pStyle w:val="Heading2"/>
+      </w:pPr>
+      <w:r>
+        <w:rPr/>
+        <w:t xml:space="preserve">English only</w:t>
+      </w:r>
+    </w:p>
+    <w:p>
+      <w:pPr>
+        <w:pStyle w:val="Bullet"/>
+      </w:pPr>
+      <w:r>
+        <w:rPr/>
+        <w:t xml:space="preserve">•</w:t>
+        <w:tab/>
+        <w:t xml:space="preserve">RMS accepts English text only: letters, digits and common punctuation (no accented letters and no other scripts). It is checked for candidate and user names, designations, position and language names, decision reasons, evaluation comments and interview locations; anything else is refused with a message.</w:t>
+      </w:r>
+    </w:p>
+    <w:p>
+      <w:pPr>
+        <w:pStyle w:val="Bullet"/>
+      </w:pPr>
+      <w:r>
+        <w:rPr/>
+        <w:t xml:space="preserve">•</w:t>
+        <w:tab/>
+        <w:t xml:space="preserve">Names already stored with other characters stay as they are, but such a candidate or user can be edited only after the name is changed to English.</w:t>
       </w:r>
     </w:p>
     <w:p>
@@ -4454,6 +4823,108 @@
       </w:pPr>
       <w:r>
         <w:rPr/>
+        <w:t xml:space="preserve">Super Admin, HR or Hiring Manager: download a report</w:t>
+      </w:r>
+    </w:p>
+    <w:p>
+      <w:pPr>
+        <w:pStyle w:val="Numbered"/>
+      </w:pPr>
+      <w:r>
+        <w:rPr/>
+        <w:t xml:space="preserve">1.</w:t>
+        <w:tab/>
+        <w:t xml:space="preserve">Open </w:t>
+      </w:r>
+      <w:r>
+        <w:rPr>
+          <w:b/>
+        </w:rPr>
+        <w:t xml:space="preserve">Reports</w:t>
+      </w:r>
+      <w:r>
+        <w:rPr/>
+        <w:t xml:space="preserve"> and click the report you want (Candidates, Candidate Status or Interview Schedule).</w:t>
+      </w:r>
+    </w:p>
+    <w:p>
+      <w:pPr>
+        <w:pStyle w:val="Numbered"/>
+      </w:pPr>
+      <w:r>
+        <w:rPr/>
+        <w:t xml:space="preserve">2.</w:t>
+        <w:tab/>
+        <w:t xml:space="preserve">Open the downloaded CSV file in Excel. Use only English when you enter data, so that names read correctly.</w:t>
+      </w:r>
+    </w:p>
+    <w:p>
+      <w:pPr>
+        <w:pStyle w:val="Heading2"/>
+      </w:pPr>
+      <w:r>
+        <w:rPr/>
+        <w:t xml:space="preserve">Super Admin: see who did what</w:t>
+      </w:r>
+    </w:p>
+    <w:p>
+      <w:pPr>
+        <w:pStyle w:val="Numbered"/>
+      </w:pPr>
+      <w:r>
+        <w:rPr/>
+        <w:t xml:space="preserve">1.</w:t>
+        <w:tab/>
+        <w:t xml:space="preserve">Open </w:t>
+      </w:r>
+      <w:r>
+        <w:rPr>
+          <w:b/>
+        </w:rPr>
+        <w:t xml:space="preserve">Activity Log</w:t>
+      </w:r>
+      <w:r>
+        <w:rPr/>
+        <w:t xml:space="preserve">. Choose an action in the filter (for example Selected) and click </w:t>
+      </w:r>
+      <w:r>
+        <w:rPr>
+          <w:b/>
+        </w:rPr>
+        <w:t xml:space="preserve">Show</w:t>
+      </w:r>
+      <w:r>
+        <w:rPr/>
+        <w:t xml:space="preserve">.</w:t>
+      </w:r>
+    </w:p>
+    <w:p>
+      <w:pPr>
+        <w:pStyle w:val="Numbered"/>
+      </w:pPr>
+      <w:r>
+        <w:rPr/>
+        <w:t xml:space="preserve">2.</w:t>
+        <w:tab/>
+        <w:t xml:space="preserve">Use </w:t>
+      </w:r>
+      <w:r>
+        <w:rPr>
+          <w:b/>
+        </w:rPr>
+        <w:t xml:space="preserve">Download CSV</w:t>
+      </w:r>
+      <w:r>
+        <w:rPr/>
+        <w:t xml:space="preserve"> to keep a copy.</w:t>
+      </w:r>
+    </w:p>
+    <w:p>
+      <w:pPr>
+        <w:pStyle w:val="Heading2"/>
+      </w:pPr>
+      <w:r>
+        <w:rPr/>
         <w:t xml:space="preserve">Super Admin, HR or Hiring Manager: review results and decide</w:t>
       </w:r>
     </w:p>
@@ -5189,6 +5660,47 @@
           </w:p>
         </w:tc>
       </w:tr>
+      <w:tr>
+        <w:trPr>
+          <w:cantSplit/>
+        </w:trPr>
+        <w:tc>
+          <w:tcPr/>
+          <w:p>
+            <w:pPr>
+              <w:pStyle w:val="TableText"/>
+            </w:pPr>
+            <w:r>
+              <w:rPr/>
+              <w:t xml:space="preserve">Activity log entry</w:t>
+            </w:r>
+          </w:p>
+        </w:tc>
+        <w:tc>
+          <w:tcPr/>
+          <w:p>
+            <w:pPr>
+              <w:pStyle w:val="TableText"/>
+            </w:pPr>
+            <w:r>
+              <w:rPr/>
+              <w:t xml:space="preserve">Time, user, action (Marked, Selected, Rejected, On hold, interview, candidate, user and report actions), the candidate, user or report concerned, a short detail (for example the total score)</w:t>
+            </w:r>
+          </w:p>
+        </w:tc>
+        <w:tc>
+          <w:tcPr/>
+          <w:p>
+            <w:pPr>
+              <w:pStyle w:val="TableText"/>
+            </w:pPr>
+            <w:r>
+              <w:rPr/>
+              <w:t xml:space="preserve">Written by RMS only; read by Super Admin</w:t>
+            </w:r>
+          </w:p>
+        </w:tc>
+      </w:tr>
     </w:tbl>
     <w:p>
       <w:pPr>
@@ -5531,6 +6043,39 @@
         <w:t xml:space="preserve">•</w:t>
         <w:tab/>
         <w:t xml:space="preserve">An interview needs an interviewer who is assigned to the candidate and active, and a date and time; the same interviewer can't have two interviews at the same start time; only a Scheduled interview can be cancelled, and a cancelled one can't be changed.</w:t>
+      </w:r>
+    </w:p>
+    <w:p>
+      <w:pPr>
+        <w:pStyle w:val="Bullet"/>
+      </w:pPr>
+      <w:r>
+        <w:rPr/>
+        <w:t xml:space="preserve">•</w:t>
+        <w:tab/>
+        <w:t xml:space="preserve">Text must be in English (letters, digits and common punctuation) in names, designations, position and language names, decision reasons, evaluation comments and interview locations.</w:t>
+      </w:r>
+    </w:p>
+    <w:p>
+      <w:pPr>
+        <w:pStyle w:val="Bullet"/>
+      </w:pPr>
+      <w:r>
+        <w:rPr/>
+        <w:t xml:space="preserve">•</w:t>
+        <w:tab/>
+        <w:t xml:space="preserve">Marking, selecting, rejecting, holding, interview changes, candidate and user changes and report downloads are written to the activity log with the user and the time; the log can be read only by a Super Admin and can't be changed in RMS.</w:t>
+      </w:r>
+    </w:p>
+    <w:p>
+      <w:pPr>
+        <w:pStyle w:val="Bullet"/>
+      </w:pPr>
+      <w:r>
+        <w:rPr/>
+        <w:t xml:space="preserve">•</w:t>
+        <w:tab/>
+        <w:t xml:space="preserve">Reports hold only what the matching screen shows; Interviewers can't download them, and only a Super Admin can download the activity log.</w:t>
       </w:r>
     </w:p>
     <w:p>
@@ -5671,19 +6216,19 @@
             </w:pPr>
             <w:r>
               <w:rPr/>
-              <w:t xml:space="preserve">Partial</w:t>
-            </w:r>
-          </w:p>
-        </w:tc>
-        <w:tc>
-          <w:tcPr/>
-          <w:p>
-            <w:pPr>
-              <w:pStyle w:val="TableText"/>
-            </w:pPr>
-            <w:r>
-              <w:rPr/>
-              <w:t xml:space="preserve">Such names are stored as codes and display incorrectly.</w:t>
+              <w:t xml:space="preserve">Closed by decision</w:t>
+            </w:r>
+          </w:p>
+        </w:tc>
+        <w:tc>
+          <w:tcPr/>
+          <w:p>
+            <w:pPr>
+              <w:pStyle w:val="TableText"/>
+            </w:pPr>
+            <w:r>
+              <w:rPr/>
+              <w:t xml:space="preserve">Only English is accepted, so such names are refused instead of being stored as unreadable codes. Names already stored that way stay until corrected.</w:t>
             </w:r>
           </w:p>
         </w:tc>
@@ -5712,31 +6257,31 @@
             </w:pPr>
             <w:r>
               <w:rPr/>
-              <w:t xml:space="preserve">Reports or export (Excel, PDF)</w:t>
-            </w:r>
-          </w:p>
-        </w:tc>
-        <w:tc>
-          <w:tcPr/>
-          <w:p>
-            <w:pPr>
-              <w:pStyle w:val="TableText"/>
-            </w:pPr>
-            <w:r>
-              <w:rPr/>
-              <w:t xml:space="preserve">Not built</w:t>
-            </w:r>
-          </w:p>
-        </w:tc>
-        <w:tc>
-          <w:tcPr/>
-          <w:p>
-            <w:pPr>
-              <w:pStyle w:val="TableText"/>
-            </w:pPr>
-            <w:r>
-              <w:rPr/>
-              <w:t xml:space="preserve">Results can only be viewed on screen.</w:t>
+              <w:t xml:space="preserve">Reports or export</w:t>
+            </w:r>
+          </w:p>
+        </w:tc>
+        <w:tc>
+          <w:tcPr/>
+          <w:p>
+            <w:pPr>
+              <w:pStyle w:val="TableText"/>
+            </w:pPr>
+            <w:r>
+              <w:rPr/>
+              <w:t xml:space="preserve">Partial</w:t>
+            </w:r>
+          </w:p>
+        </w:tc>
+        <w:tc>
+          <w:tcPr/>
+          <w:p>
+            <w:pPr>
+              <w:pStyle w:val="TableText"/>
+            </w:pPr>
+            <w:r>
+              <w:rPr/>
+              <w:t xml:space="preserve">CSV for Excel: candidates, candidate status, interview schedule and the activity log. No .xlsx or PDF, and no other reports yet.</w:t>
             </w:r>
           </w:p>
         </w:tc>
@@ -5777,19 +6322,19 @@
             </w:pPr>
             <w:r>
               <w:rPr/>
-              <w:t xml:space="preserve">Not built</w:t>
-            </w:r>
-          </w:p>
-        </w:tc>
-        <w:tc>
-          <w:tcPr/>
-          <w:p>
-            <w:pPr>
-              <w:pStyle w:val="TableText"/>
-            </w:pPr>
-            <w:r>
-              <w:rPr/>
-              <w:t xml:space="preserve">Changes can't be traced, except user changes in the server log.</w:t>
+              <w:t xml:space="preserve">Partial</w:t>
+            </w:r>
+          </w:p>
+        </w:tc>
+        <w:tc>
+          <w:tcPr/>
+          <w:p>
+            <w:pPr>
+              <w:pStyle w:val="TableText"/>
+            </w:pPr>
+            <w:r>
+              <w:rPr/>
+              <w:t xml:space="preserve">The activity log records marking, decisions, interviews, assignments, candidate and user changes and report downloads. Sign-ins, document actions, jobs and master data are not recorded.</w:t>
             </w:r>
           </w:p>
         </w:tc>
@@ -5983,6 +6528,27 @@
       </w:pPr>
       <w:r>
         <w:rPr/>
+        <w:t xml:space="preserve">10.</w:t>
+        <w:tab/>
+        <w:t xml:space="preserve"/>
+      </w:r>
+      <w:r>
+        <w:rPr>
+          <w:b/>
+        </w:rPr>
+        <w:t xml:space="preserve">Reports, activity log and English only</w:t>
+      </w:r>
+      <w:r>
+        <w:rPr/>
+        <w:t xml:space="preserve"> (3 October 2026): reports are CSV files for Excel; the activity log records marking, selecting, rejecting and the other actions listed above and is read by Super Admin only; only English text is accepted; e-mail notifications will be decided later.</w:t>
+      </w:r>
+    </w:p>
+    <w:p>
+      <w:pPr>
+        <w:pStyle w:val="Numbered"/>
+      </w:pPr>
+      <w:r>
+        <w:rPr/>
         <w:t xml:space="preserve">9.</w:t>
         <w:tab/>
         <w:t xml:space="preserve"/>
@@ -6046,7 +6612,7 @@
       </w:r>
       <w:r>
         <w:rPr/>
-        <w:t xml:space="preserve"> are e-mail or calendar notifications needed for interviews? Should past times be refused, and do all users work in the server's time zone?</w:t>
+        <w:t xml:space="preserve"> e-mail or calendar notifications will be decided later. Should past times be refused, and do all users work in the server's time zone?</w:t>
       </w:r>
     </w:p>
     <w:p>
@@ -6067,7 +6633,28 @@
       </w:r>
       <w:r>
         <w:rPr/>
-        <w:t xml:space="preserve"> which exports or counts are needed first?</w:t>
+        <w:t xml:space="preserve"> which further reports are needed (counts per position, per status or per month; Excel or PDF files)?</w:t>
+      </w:r>
+    </w:p>
+    <w:p>
+      <w:pPr>
+        <w:pStyle w:val="Numbered"/>
+      </w:pPr>
+      <w:r>
+        <w:rPr/>
+        <w:t xml:space="preserve">5.</w:t>
+        <w:tab/>
+        <w:t xml:space="preserve"/>
+      </w:r>
+      <w:r>
+        <w:rPr>
+          <w:b/>
+        </w:rPr>
+        <w:t xml:space="preserve">Activity log:</w:t>
+      </w:r>
+      <w:r>
+        <w:rPr/>
+        <w:t xml:space="preserve"> should sign-ins, document uploads and deletes, jobs and master data be recorded too? How long must entries be kept, and who archives them?</w:t>
       </w:r>
     </w:p>
     <w:p>

</xml_diff>

<commit_message>
Activity log round 2, no interviews in the past, Deleted Candidates page
Log sign-ins, failed sign-ins, document actions, jobs, positions and languages;
refuse scheduled interviews in the past; Super Admin page to delete the stored
files of deleted candidates; docs and the three handbooks.

Co-Authored-By: Claude Sonnet 5.5 <noreply@anthropic.com>
</commit_message>
<xml_diff>
--- a/docs/handbooks/RMS Business Analyst Guide.docx
+++ b/docs/handbooks/RMS Business Analyst Guide.docx
@@ -2408,6 +2408,83 @@
             </w:pPr>
             <w:r>
               <w:rPr/>
+              <w:t xml:space="preserve">Administration › Deleted Candidates (delete their document files permanently)</w:t>
+            </w:r>
+          </w:p>
+        </w:tc>
+        <w:tc>
+          <w:tcPr/>
+          <w:p>
+            <w:pPr>
+              <w:pStyle w:val="TableText"/>
+            </w:pPr>
+            <w:r>
+              <w:rPr/>
+              <w:t xml:space="preserve">Live</w:t>
+            </w:r>
+          </w:p>
+        </w:tc>
+        <w:tc>
+          <w:tcPr/>
+          <w:p>
+            <w:pPr>
+              <w:pStyle w:val="TableText"/>
+            </w:pPr>
+            <w:r>
+              <w:rPr/>
+              <w:t xml:space="preserve">Yes</w:t>
+            </w:r>
+          </w:p>
+        </w:tc>
+        <w:tc>
+          <w:tcPr/>
+          <w:p>
+            <w:pPr>
+              <w:pStyle w:val="TableText"/>
+            </w:pPr>
+            <w:r>
+              <w:rPr/>
+              <w:t xml:space="preserve">Refused</w:t>
+            </w:r>
+          </w:p>
+        </w:tc>
+        <w:tc>
+          <w:tcPr/>
+          <w:p>
+            <w:pPr>
+              <w:pStyle w:val="TableText"/>
+            </w:pPr>
+            <w:r>
+              <w:rPr/>
+              <w:t xml:space="preserve">Refused</w:t>
+            </w:r>
+          </w:p>
+        </w:tc>
+        <w:tc>
+          <w:tcPr/>
+          <w:p>
+            <w:pPr>
+              <w:pStyle w:val="TableText"/>
+            </w:pPr>
+            <w:r>
+              <w:rPr/>
+              <w:t xml:space="preserve">Refused</w:t>
+            </w:r>
+          </w:p>
+        </w:tc>
+      </w:tr>
+      <w:tr>
+        <w:trPr>
+          <w:cantSplit/>
+        </w:trPr>
+        <w:tc>
+          <w:tcPr/>
+          <w:p>
+            <w:pPr>
+              <w:pStyle w:val="TableText"/>
+            </w:pPr>
+            <w:r>
+              <w:rPr/>
               <w:t xml:space="preserve">Log out (top bar)</w:t>
             </w:r>
           </w:p>
@@ -3839,7 +3916,7 @@
         <w:rPr/>
         <w:t xml:space="preserve">•</w:t>
         <w:tab/>
-        <w:t xml:space="preserve">Times are the server's local time, as typed. Two interviews for the same interviewer at the same start time are refused. Past times are accepted.</w:t>
+        <w:t xml:space="preserve">Times are the server's local time, as typed. Two interviews for the same interviewer at the same start time are refused. A scheduled interview can't be put in a time that has passed; an interview already in the past can still get a location or be marked Done.</w:t>
       </w:r>
     </w:p>
     <w:p>
@@ -4055,7 +4132,7 @@
         <w:rPr/>
         <w:t xml:space="preserve">•</w:t>
         <w:tab/>
-        <w:t xml:space="preserve">Not recorded yet: sign-ins and sign-outs, document uploads and deletes, jobs and master data. Details never hold scores per criterion, comments, reasons, names or passwords.</w:t>
+        <w:t xml:space="preserve">Also recorded: sign-ins and failed sign-ins (the typed username only if it looks like a username), document uploads, deletes and permanent deletes, and changes to jobs, positions and languages. Not recorded: sign-outs and a user's own password changes. Details never hold scores per criterion, comments, reasons, names or passwords.</w:t>
       </w:r>
     </w:p>
     <w:p>
@@ -4864,6 +4941,57 @@
       </w:pPr>
       <w:r>
         <w:rPr/>
+        <w:t xml:space="preserve">Super Admin: delete the files of a deleted candidate</w:t>
+      </w:r>
+    </w:p>
+    <w:p>
+      <w:pPr>
+        <w:pStyle w:val="Numbered"/>
+      </w:pPr>
+      <w:r>
+        <w:rPr/>
+        <w:t xml:space="preserve">1.</w:t>
+        <w:tab/>
+        <w:t xml:space="preserve">Open </w:t>
+      </w:r>
+      <w:r>
+        <w:rPr>
+          <w:b/>
+        </w:rPr>
+        <w:t xml:space="preserve">Deleted Candidates</w:t>
+      </w:r>
+      <w:r>
+        <w:rPr/>
+        <w:t xml:space="preserve">. Candidates with files still stored show the number of files.</w:t>
+      </w:r>
+    </w:p>
+    <w:p>
+      <w:pPr>
+        <w:pStyle w:val="Numbered"/>
+      </w:pPr>
+      <w:r>
+        <w:rPr/>
+        <w:t xml:space="preserve">2.</w:t>
+        <w:tab/>
+        <w:t xml:space="preserve">Enter the reason (English) and click </w:t>
+      </w:r>
+      <w:r>
+        <w:rPr>
+          <w:b/>
+        </w:rPr>
+        <w:t xml:space="preserve">Delete</w:t>
+      </w:r>
+      <w:r>
+        <w:rPr/>
+        <w:t xml:space="preserve">, then confirm. The records stay; only the files are removed, and it can't be undone.</w:t>
+      </w:r>
+    </w:p>
+    <w:p>
+      <w:pPr>
+        <w:pStyle w:val="Heading2"/>
+      </w:pPr>
+      <w:r>
+        <w:rPr/>
         <w:t xml:space="preserve">Super Admin: see who did what</w:t>
       </w:r>
     </w:p>
@@ -6528,6 +6656,27 @@
       </w:pPr>
       <w:r>
         <w:rPr/>
+        <w:t xml:space="preserve">11.</w:t>
+        <w:tab/>
+        <w:t xml:space="preserve"/>
+      </w:r>
+      <w:r>
+        <w:rPr>
+          <w:b/>
+        </w:rPr>
+        <w:t xml:space="preserve">Past interview times and deleted candidates</w:t>
+      </w:r>
+      <w:r>
+        <w:rPr/>
+        <w:t xml:space="preserve"> (3 October 2026): a scheduled interview can't be put in the past; a Super Admin can delete the files of deleted candidates; sign-ins, document actions, jobs and master data are logged.</w:t>
+      </w:r>
+    </w:p>
+    <w:p>
+      <w:pPr>
+        <w:pStyle w:val="Numbered"/>
+      </w:pPr>
+      <w:r>
+        <w:rPr/>
         <w:t xml:space="preserve">10.</w:t>
         <w:tab/>
         <w:t xml:space="preserve"/>
@@ -6612,7 +6761,7 @@
       </w:r>
       <w:r>
         <w:rPr/>
-        <w:t xml:space="preserve"> e-mail or calendar notifications will be decided later. Should past times be refused, and do all users work in the server's time zone?</w:t>
+        <w:t xml:space="preserve"> e-mail or calendar notifications will be decided later. Do all users work in the server's time zone?</w:t>
       </w:r>
     </w:p>
     <w:p>
@@ -6650,11 +6799,11 @@
         <w:rPr>
           <w:b/>
         </w:rPr>
-        <w:t xml:space="preserve">Activity log:</w:t>
-      </w:r>
-      <w:r>
-        <w:rPr/>
-        <w:t xml:space="preserve"> should sign-ins, document uploads and deletes, jobs and master data be recorded too? How long must entries be kept, and who archives them?</w:t>
+        <w:t xml:space="preserve">Retention:</w:t>
+      </w:r>
+      <w:r>
+        <w:rPr/>
+        <w:t xml:space="preserve"> how long must activity log entries and candidate documents be kept, and who deletes or archives them? RMS deletes nothing by itself; a Super Admin deletes files by hand under Deleted Candidates.</w:t>
       </w:r>
     </w:p>
     <w:p>

</xml_diff>